<commit_message>
docs: raport and checklist updated
</commit_message>
<xml_diff>
--- a/doc/checklist.docx
+++ b/doc/checklist.docx
@@ -92,7 +92,7 @@
           <w:rFonts w:hint="eastAsia"/>
           <w:noProof/>
         </w:rPr>
-        <w:t>11.04.2026</w:t>
+        <w:t>24.06.2026</w:t>
       </w:r>
       <w:r>
         <w:fldChar w:fldCharType="end"/>
@@ -576,6 +576,14 @@
                 <w:lang w:val="pl-PL"/>
               </w:rPr>
             </w:pPr>
+            <w:r>
+              <w:rPr>
+                <w:sz w:val="22"/>
+                <w:szCs w:val="22"/>
+                <w:lang w:val="pl-PL"/>
+              </w:rPr>
+              <w:t>TAK</w:t>
+            </w:r>
           </w:p>
         </w:tc>
       </w:tr>
@@ -811,6 +819,14 @@
                 <w:lang w:val="pl-PL"/>
               </w:rPr>
             </w:pPr>
+            <w:r>
+              <w:rPr>
+                <w:sz w:val="22"/>
+                <w:szCs w:val="22"/>
+                <w:lang w:val="pl-PL"/>
+              </w:rPr>
+              <w:t>2025.1</w:t>
+            </w:r>
           </w:p>
         </w:tc>
       </w:tr>
@@ -909,6 +925,14 @@
                 <w:lang w:val="pl-PL"/>
               </w:rPr>
             </w:pPr>
+            <w:r>
+              <w:rPr>
+                <w:sz w:val="22"/>
+                <w:szCs w:val="22"/>
+                <w:lang w:val="pl-PL"/>
+              </w:rPr>
+              <w:t>0</w:t>
+            </w:r>
           </w:p>
         </w:tc>
       </w:tr>
@@ -1023,6 +1047,14 @@
                 <w:lang w:val="pl-PL"/>
               </w:rPr>
             </w:pPr>
+            <w:r>
+              <w:rPr>
+                <w:sz w:val="22"/>
+                <w:szCs w:val="22"/>
+                <w:lang w:val="pl-PL"/>
+              </w:rPr>
+              <w:t>0</w:t>
+            </w:r>
           </w:p>
         </w:tc>
       </w:tr>
@@ -1217,6 +1249,23 @@
                 <w:lang w:val="pl-PL"/>
               </w:rPr>
             </w:pPr>
+            <w:r>
+              <w:rPr>
+                <w:rFonts w:hint="eastAsia"/>
+                <w:sz w:val="22"/>
+                <w:szCs w:val="22"/>
+                <w:lang w:val="pl-PL"/>
+              </w:rPr>
+              <w:t>K</w:t>
+            </w:r>
+            <w:r>
+              <w:rPr>
+                <w:sz w:val="22"/>
+                <w:szCs w:val="22"/>
+                <w:lang w:val="pl-PL"/>
+              </w:rPr>
+              <w:t>lawiatura, audio jack</w:t>
+            </w:r>
           </w:p>
         </w:tc>
       </w:tr>
@@ -1315,6 +1364,14 @@
                 <w:lang w:val="pl-PL"/>
               </w:rPr>
             </w:pPr>
+            <w:r>
+              <w:rPr>
+                <w:sz w:val="22"/>
+                <w:szCs w:val="22"/>
+                <w:lang w:val="pl-PL"/>
+              </w:rPr>
+              <w:t>TAK</w:t>
+            </w:r>
           </w:p>
         </w:tc>
       </w:tr>
@@ -1404,6 +1461,14 @@
                 <w:lang w:val="pl-PL"/>
               </w:rPr>
             </w:pPr>
+            <w:r>
+              <w:rPr>
+                <w:sz w:val="22"/>
+                <w:szCs w:val="22"/>
+                <w:lang w:val="pl-PL"/>
+              </w:rPr>
+              <w:t>1024/768</w:t>
+            </w:r>
           </w:p>
         </w:tc>
       </w:tr>
@@ -1438,7 +1503,23 @@
                 <w:szCs w:val="22"/>
                 <w:lang w:val="pl-PL"/>
               </w:rPr>
-              <w:t>Czy układ używa resetu synchronicznego? ( TAK / NIE )</w:t>
+              <w:t xml:space="preserve">Czy układ używa resetu </w:t>
+            </w:r>
+            <w:r>
+              <w:rPr>
+                <w:sz w:val="22"/>
+                <w:szCs w:val="22"/>
+                <w:lang w:val="pl-PL"/>
+              </w:rPr>
+              <w:t>a</w:t>
+            </w:r>
+            <w:r>
+              <w:rPr>
+                <w:sz w:val="22"/>
+                <w:szCs w:val="22"/>
+                <w:lang w:val="pl-PL"/>
+              </w:rPr>
+              <w:t>synchronicznego? ( TAK / NIE )</w:t>
             </w:r>
           </w:p>
         </w:tc>
@@ -1502,6 +1583,14 @@
                 <w:lang w:val="pl-PL"/>
               </w:rPr>
             </w:pPr>
+            <w:r>
+              <w:rPr>
+                <w:sz w:val="22"/>
+                <w:szCs w:val="22"/>
+                <w:lang w:val="pl-PL"/>
+              </w:rPr>
+              <w:t>TAK/</w:t>
+            </w:r>
           </w:p>
         </w:tc>
       </w:tr>
@@ -1680,6 +1769,14 @@
                 <w:lang w:val="pl-PL"/>
               </w:rPr>
             </w:pPr>
+            <w:r>
+              <w:rPr>
+                <w:sz w:val="22"/>
+                <w:szCs w:val="22"/>
+                <w:lang w:val="pl-PL"/>
+              </w:rPr>
+              <w:t>TAK</w:t>
+            </w:r>
           </w:p>
         </w:tc>
       </w:tr>
@@ -1935,7 +2032,7 @@
         <w:rFonts w:hint="eastAsia"/>
         <w:noProof/>
       </w:rPr>
-      <w:t>11.04.2026</w:t>
+      <w:t>24.06.2026</w:t>
     </w:r>
     <w:r>
       <w:fldChar w:fldCharType="end"/>

</xml_diff>